<commit_message>
Add historical behavior calibration to gametheory skill
</commit_message>
<xml_diff>
--- a/skills/yao-gametheory-skill/reports/price-war-case.docx
+++ b/skills/yao-gametheory-skill/reports/price-war-case.docx
@@ -25,7 +25,7 @@
           <w:rFonts w:ascii="Arial" w:hAnsi="Arial" w:eastAsia="Microsoft YaHei"/>
           <w:sz w:val="20"/>
         </w:rPr>
-        <w:t xml:space="preserve">生成日期：2026-05-11</w:t>
+        <w:t xml:space="preserve">生成日期：2026-05-12</w:t>
       </w:r>
     </w:p>
     <w:p>
@@ -730,7 +730,7 @@
                 <w:rFonts w:ascii="Arial" w:hAnsi="Arial" w:eastAsia="Microsoft YaHei"/>
                 <w:sz w:val="18"/>
               </w:rPr>
-              <w:t xml:space="preserve">framework hygiene</w:t>
+              <w:t xml:space="preserve">historical behavior hygiene</w:t>
             </w:r>
           </w:p>
         </w:tc>
@@ -766,7 +766,7 @@
                 <w:rFonts w:ascii="Arial" w:hAnsi="Arial" w:eastAsia="Microsoft YaHei"/>
                 <w:sz w:val="18"/>
               </w:rPr>
-              <w:t xml:space="preserve">框架选择先从结构出发，而不是只套用著名博弈。</w:t>
+              <w:t xml:space="preserve">已用真实历史行为或同类经验校正玩家理性概率。</w:t>
             </w:r>
           </w:p>
         </w:tc>
@@ -786,6 +786,62 @@
                 <w:rFonts w:ascii="Arial" w:hAnsi="Arial" w:eastAsia="Microsoft YaHei"/>
                 <w:sz w:val="18"/>
               </w:rPr>
+              <w:t xml:space="preserve">framework hygiene</w:t>
+            </w:r>
+          </w:p>
+        </w:tc>
+        <w:tc>
+          <w:tcPr>
+            <w:tcW w:w="2200" w:type="dxa"/>
+            <w:vAlign w:val="top"/>
+          </w:tcPr>
+          <w:p>
+            <w:pPr>
+              <w:spacing w:after="0"/>
+            </w:pPr>
+            <w:r>
+              <w:rPr>
+                <w:rFonts w:ascii="Arial" w:hAnsi="Arial" w:eastAsia="Microsoft YaHei"/>
+                <w:sz w:val="18"/>
+              </w:rPr>
+              <w:t xml:space="preserve">pass</w:t>
+            </w:r>
+          </w:p>
+        </w:tc>
+        <w:tc>
+          <w:tcPr>
+            <w:tcW w:w="9800" w:type="dxa"/>
+            <w:vAlign w:val="top"/>
+          </w:tcPr>
+          <w:p>
+            <w:pPr>
+              <w:spacing w:after="0"/>
+            </w:pPr>
+            <w:r>
+              <w:rPr>
+                <w:rFonts w:ascii="Arial" w:hAnsi="Arial" w:eastAsia="Microsoft YaHei"/>
+                <w:sz w:val="18"/>
+              </w:rPr>
+              <w:t xml:space="preserve">框架选择先从结构出发，而不是只套用著名博弈。</w:t>
+            </w:r>
+          </w:p>
+        </w:tc>
+      </w:tr>
+      <w:tr>
+        <w:tc>
+          <w:tcPr>
+            <w:tcW w:w="3400" w:type="dxa"/>
+            <w:vAlign w:val="top"/>
+          </w:tcPr>
+          <w:p>
+            <w:pPr>
+              <w:spacing w:after="0"/>
+            </w:pPr>
+            <w:r>
+              <w:rPr>
+                <w:rFonts w:ascii="Arial" w:hAnsi="Arial" w:eastAsia="Microsoft YaHei"/>
+                <w:sz w:val="18"/>
+              </w:rPr>
               <w:t xml:space="preserve">safety hygiene</w:t>
             </w:r>
           </w:p>
@@ -823,6 +879,1167 @@
                 <w:sz w:val="18"/>
               </w:rPr>
               <w:t xml:space="preserve">已标记法律、投资、反垄断或合规边界。</w:t>
+            </w:r>
+          </w:p>
+        </w:tc>
+      </w:tr>
+    </w:tbl>
+    <w:p>
+      <w:pPr>
+        <w:spacing w:before="220" w:after="100"/>
+      </w:pPr>
+      <w:r>
+        <w:rPr>
+          <w:rFonts w:ascii="Arial" w:hAnsi="Arial" w:eastAsia="Microsoft YaHei"/>
+          <w:b/>
+          <w:sz w:val="26"/>
+        </w:rPr>
+        <w:t xml:space="preserve">历史行为与理性概率校正</w:t>
+      </w:r>
+    </w:p>
+    <w:p>
+      <w:pPr>
+        <w:spacing w:after="70"/>
+      </w:pPr>
+      <w:r>
+        <w:rPr>
+          <w:rFonts w:ascii="Arial" w:hAnsi="Arial" w:eastAsia="Microsoft YaHei"/>
+          <w:sz w:val="20"/>
+        </w:rPr>
+        <w:t xml:space="preserve">真实历史行为优先于纯模型推演；多轮博弈中应防止高估对手完全理性和时间一致性。</w:t>
+      </w:r>
+    </w:p>
+    <w:tbl>
+      <w:tblPr>
+        <w:tblW w:w="15400" w:type="dxa"/>
+        <w:tblLayout w:type="fixed"/>
+        <w:tblBorders>
+          <w:top w:val="single" w:sz="4" w:color="D9E0D8"/>
+          <w:left w:val="single" w:sz="4" w:color="D9E0D8"/>
+          <w:bottom w:val="single" w:sz="4" w:color="D9E0D8"/>
+          <w:right w:val="single" w:sz="4" w:color="D9E0D8"/>
+          <w:insideH w:val="single" w:sz="4" w:color="D9E0D8"/>
+          <w:insideV w:val="single" w:sz="4" w:color="D9E0D8"/>
+        </w:tblBorders>
+        <w:tblCellMar>
+          <w:top w:w="80" w:type="dxa"/>
+          <w:left w:w="80" w:type="dxa"/>
+          <w:bottom w:w="80" w:type="dxa"/>
+          <w:right w:w="80" w:type="dxa"/>
+        </w:tblCellMar>
+      </w:tblPr>
+      <w:tblGrid>
+        <w:gridCol w:w="1800"/>
+        <w:gridCol w:w="1700"/>
+        <w:gridCol w:w="1900"/>
+        <w:gridCol w:w="1400"/>
+        <w:gridCol w:w="1700"/>
+        <w:gridCol w:w="6900"/>
+      </w:tblGrid>
+      <w:tr>
+        <w:tc>
+          <w:tcPr>
+            <w:tcW w:w="1800" w:type="dxa"/>
+            <w:vAlign w:val="top"/>
+          </w:tcPr>
+          <w:p>
+            <w:pPr>
+              <w:spacing w:after="0"/>
+            </w:pPr>
+            <w:r>
+              <w:rPr>
+                <w:rFonts w:ascii="Arial" w:hAnsi="Arial" w:eastAsia="Microsoft YaHei"/>
+                <w:sz w:val="18"/>
+                <w:b/>
+              </w:rPr>
+              <w:t xml:space="preserve">玩家</w:t>
+            </w:r>
+          </w:p>
+        </w:tc>
+        <w:tc>
+          <w:tcPr>
+            <w:tcW w:w="1700" w:type="dxa"/>
+            <w:vAlign w:val="top"/>
+          </w:tcPr>
+          <w:p>
+            <w:pPr>
+              <w:spacing w:after="0"/>
+            </w:pPr>
+            <w:r>
+              <w:rPr>
+                <w:rFonts w:ascii="Arial" w:hAnsi="Arial" w:eastAsia="Microsoft YaHei"/>
+                <w:sz w:val="18"/>
+                <w:b/>
+              </w:rPr>
+              <w:t xml:space="preserve">先验理性</w:t>
+            </w:r>
+          </w:p>
+        </w:tc>
+        <w:tc>
+          <w:tcPr>
+            <w:tcW w:w="1900" w:type="dxa"/>
+            <w:vAlign w:val="top"/>
+          </w:tcPr>
+          <w:p>
+            <w:pPr>
+              <w:spacing w:after="0"/>
+            </w:pPr>
+            <w:r>
+              <w:rPr>
+                <w:rFonts w:ascii="Arial" w:hAnsi="Arial" w:eastAsia="Microsoft YaHei"/>
+                <w:sz w:val="18"/>
+                <w:b/>
+              </w:rPr>
+              <w:t xml:space="preserve">历史校正后</w:t>
+            </w:r>
+          </w:p>
+        </w:tc>
+        <w:tc>
+          <w:tcPr>
+            <w:tcW w:w="1400" w:type="dxa"/>
+            <w:vAlign w:val="top"/>
+          </w:tcPr>
+          <w:p>
+            <w:pPr>
+              <w:spacing w:after="0"/>
+            </w:pPr>
+            <w:r>
+              <w:rPr>
+                <w:rFonts w:ascii="Arial" w:hAnsi="Arial" w:eastAsia="Microsoft YaHei"/>
+                <w:sz w:val="18"/>
+                <w:b/>
+              </w:rPr>
+              <w:t xml:space="preserve">调整</w:t>
+            </w:r>
+          </w:p>
+        </w:tc>
+        <w:tc>
+          <w:tcPr>
+            <w:tcW w:w="1700" w:type="dxa"/>
+            <w:vAlign w:val="top"/>
+          </w:tcPr>
+          <w:p>
+            <w:pPr>
+              <w:spacing w:after="0"/>
+            </w:pPr>
+            <w:r>
+              <w:rPr>
+                <w:rFonts w:ascii="Arial" w:hAnsi="Arial" w:eastAsia="Microsoft YaHei"/>
+                <w:sz w:val="18"/>
+                <w:b/>
+              </w:rPr>
+              <w:t xml:space="preserve">证据质量</w:t>
+            </w:r>
+          </w:p>
+        </w:tc>
+        <w:tc>
+          <w:tcPr>
+            <w:tcW w:w="6900" w:type="dxa"/>
+            <w:vAlign w:val="top"/>
+          </w:tcPr>
+          <w:p>
+            <w:pPr>
+              <w:spacing w:after="0"/>
+            </w:pPr>
+            <w:r>
+              <w:rPr>
+                <w:rFonts w:ascii="Arial" w:hAnsi="Arial" w:eastAsia="Microsoft YaHei"/>
+                <w:sz w:val="18"/>
+                <w:b/>
+              </w:rPr>
+              <w:t xml:space="preserve">解释</w:t>
+            </w:r>
+          </w:p>
+        </w:tc>
+      </w:tr>
+      <w:tr>
+        <w:tc>
+          <w:tcPr>
+            <w:tcW w:w="1800" w:type="dxa"/>
+            <w:vAlign w:val="top"/>
+          </w:tcPr>
+          <w:p>
+            <w:pPr>
+              <w:spacing w:after="0"/>
+            </w:pPr>
+            <w:r>
+              <w:rPr>
+                <w:rFonts w:ascii="Arial" w:hAnsi="Arial" w:eastAsia="Microsoft YaHei"/>
+                <w:sz w:val="18"/>
+              </w:rPr>
+              <w:t xml:space="preserve">渠道商</w:t>
+            </w:r>
+          </w:p>
+        </w:tc>
+        <w:tc>
+          <w:tcPr>
+            <w:tcW w:w="1700" w:type="dxa"/>
+            <w:vAlign w:val="top"/>
+          </w:tcPr>
+          <w:p>
+            <w:pPr>
+              <w:spacing w:after="0"/>
+            </w:pPr>
+            <w:r>
+              <w:rPr>
+                <w:rFonts w:ascii="Arial" w:hAnsi="Arial" w:eastAsia="Microsoft YaHei"/>
+                <w:sz w:val="18"/>
+              </w:rPr>
+              <w:t xml:space="preserve">68%</w:t>
+            </w:r>
+          </w:p>
+        </w:tc>
+        <w:tc>
+          <w:tcPr>
+            <w:tcW w:w="1900" w:type="dxa"/>
+            <w:vAlign w:val="top"/>
+          </w:tcPr>
+          <w:p>
+            <w:pPr>
+              <w:spacing w:after="0"/>
+            </w:pPr>
+            <w:r>
+              <w:rPr>
+                <w:rFonts w:ascii="Arial" w:hAnsi="Arial" w:eastAsia="Microsoft YaHei"/>
+                <w:sz w:val="18"/>
+              </w:rPr>
+              <w:t xml:space="preserve">68%</w:t>
+            </w:r>
+          </w:p>
+        </w:tc>
+        <w:tc>
+          <w:tcPr>
+            <w:tcW w:w="1400" w:type="dxa"/>
+            <w:vAlign w:val="top"/>
+          </w:tcPr>
+          <w:p>
+            <w:pPr>
+              <w:spacing w:after="0"/>
+            </w:pPr>
+            <w:r>
+              <w:rPr>
+                <w:rFonts w:ascii="Arial" w:hAnsi="Arial" w:eastAsia="Microsoft YaHei"/>
+                <w:sz w:val="18"/>
+              </w:rPr>
+              <w:t xml:space="preserve">0%</w:t>
+            </w:r>
+          </w:p>
+        </w:tc>
+        <w:tc>
+          <w:tcPr>
+            <w:tcW w:w="1700" w:type="dxa"/>
+            <w:vAlign w:val="top"/>
+          </w:tcPr>
+          <w:p>
+            <w:pPr>
+              <w:spacing w:after="0"/>
+            </w:pPr>
+            <w:r>
+              <w:rPr>
+                <w:rFonts w:ascii="Arial" w:hAnsi="Arial" w:eastAsia="Microsoft YaHei"/>
+                <w:sz w:val="18"/>
+              </w:rPr>
+              <w:t xml:space="preserve">0%</w:t>
+            </w:r>
+          </w:p>
+        </w:tc>
+        <w:tc>
+          <w:tcPr>
+            <w:tcW w:w="6900" w:type="dxa"/>
+            <w:vAlign w:val="top"/>
+          </w:tcPr>
+          <w:p>
+            <w:pPr>
+              <w:spacing w:after="0"/>
+            </w:pPr>
+            <w:r>
+              <w:rPr>
+                <w:rFonts w:ascii="Arial" w:hAnsi="Arial" w:eastAsia="Microsoft YaHei"/>
+                <w:sz w:val="18"/>
+              </w:rPr>
+              <w:t xml:space="preserve">未提供真实历史行为数据；理性概率仍是模型先验，承诺和反应判断需要打折。</w:t>
+            </w:r>
+          </w:p>
+        </w:tc>
+      </w:tr>
+      <w:tr>
+        <w:tc>
+          <w:tcPr>
+            <w:tcW w:w="1800" w:type="dxa"/>
+            <w:vAlign w:val="top"/>
+          </w:tcPr>
+          <w:p>
+            <w:pPr>
+              <w:spacing w:after="0"/>
+            </w:pPr>
+            <w:r>
+              <w:rPr>
+                <w:rFonts w:ascii="Arial" w:hAnsi="Arial" w:eastAsia="Microsoft YaHei"/>
+                <w:sz w:val="18"/>
+              </w:rPr>
+              <w:t xml:space="preserve">头部竞品</w:t>
+            </w:r>
+          </w:p>
+        </w:tc>
+        <w:tc>
+          <w:tcPr>
+            <w:tcW w:w="1700" w:type="dxa"/>
+            <w:vAlign w:val="top"/>
+          </w:tcPr>
+          <w:p>
+            <w:pPr>
+              <w:spacing w:after="0"/>
+            </w:pPr>
+            <w:r>
+              <w:rPr>
+                <w:rFonts w:ascii="Arial" w:hAnsi="Arial" w:eastAsia="Microsoft YaHei"/>
+                <w:sz w:val="18"/>
+              </w:rPr>
+              <w:t xml:space="preserve">74%</w:t>
+            </w:r>
+          </w:p>
+        </w:tc>
+        <w:tc>
+          <w:tcPr>
+            <w:tcW w:w="1900" w:type="dxa"/>
+            <w:vAlign w:val="top"/>
+          </w:tcPr>
+          <w:p>
+            <w:pPr>
+              <w:spacing w:after="0"/>
+            </w:pPr>
+            <w:r>
+              <w:rPr>
+                <w:rFonts w:ascii="Arial" w:hAnsi="Arial" w:eastAsia="Microsoft YaHei"/>
+                <w:sz w:val="18"/>
+              </w:rPr>
+              <w:t xml:space="preserve">32%</w:t>
+            </w:r>
+          </w:p>
+        </w:tc>
+        <w:tc>
+          <w:tcPr>
+            <w:tcW w:w="1400" w:type="dxa"/>
+            <w:vAlign w:val="top"/>
+          </w:tcPr>
+          <w:p>
+            <w:pPr>
+              <w:spacing w:after="0"/>
+            </w:pPr>
+            <w:r>
+              <w:rPr>
+                <w:rFonts w:ascii="Arial" w:hAnsi="Arial" w:eastAsia="Microsoft YaHei"/>
+                <w:sz w:val="18"/>
+              </w:rPr>
+              <w:t xml:space="preserve">-42%</w:t>
+            </w:r>
+          </w:p>
+        </w:tc>
+        <w:tc>
+          <w:tcPr>
+            <w:tcW w:w="1700" w:type="dxa"/>
+            <w:vAlign w:val="top"/>
+          </w:tcPr>
+          <w:p>
+            <w:pPr>
+              <w:spacing w:after="0"/>
+            </w:pPr>
+            <w:r>
+              <w:rPr>
+                <w:rFonts w:ascii="Arial" w:hAnsi="Arial" w:eastAsia="Microsoft YaHei"/>
+                <w:sz w:val="18"/>
+              </w:rPr>
+              <w:t xml:space="preserve">77%</w:t>
+            </w:r>
+          </w:p>
+        </w:tc>
+        <w:tc>
+          <w:tcPr>
+            <w:tcW w:w="6900" w:type="dxa"/>
+            <w:vAlign w:val="top"/>
+          </w:tcPr>
+          <w:p>
+            <w:pPr>
+              <w:spacing w:after="0"/>
+            </w:pPr>
+            <w:r>
+              <w:rPr>
+                <w:rFonts w:ascii="Arial" w:hAnsi="Arial" w:eastAsia="Microsoft YaHei"/>
+                <w:sz w:val="18"/>
+              </w:rPr>
+              <w:t xml:space="preserve">真实历史行为显示该玩家未必时间一致或完全理性，应下调其长期威胁、承诺或信号可信度。</w:t>
+            </w:r>
+          </w:p>
+        </w:tc>
+      </w:tr>
+      <w:tr>
+        <w:tc>
+          <w:tcPr>
+            <w:tcW w:w="1800" w:type="dxa"/>
+            <w:vAlign w:val="top"/>
+          </w:tcPr>
+          <w:p>
+            <w:pPr>
+              <w:spacing w:after="0"/>
+            </w:pPr>
+            <w:r>
+              <w:rPr>
+                <w:rFonts w:ascii="Arial" w:hAnsi="Arial" w:eastAsia="Microsoft YaHei"/>
+                <w:sz w:val="18"/>
+              </w:rPr>
+              <w:t xml:space="preserve">我们</w:t>
+            </w:r>
+          </w:p>
+        </w:tc>
+        <w:tc>
+          <w:tcPr>
+            <w:tcW w:w="1700" w:type="dxa"/>
+            <w:vAlign w:val="top"/>
+          </w:tcPr>
+          <w:p>
+            <w:pPr>
+              <w:spacing w:after="0"/>
+            </w:pPr>
+            <w:r>
+              <w:rPr>
+                <w:rFonts w:ascii="Arial" w:hAnsi="Arial" w:eastAsia="Microsoft YaHei"/>
+                <w:sz w:val="18"/>
+              </w:rPr>
+              <w:t xml:space="preserve">78%</w:t>
+            </w:r>
+          </w:p>
+        </w:tc>
+        <w:tc>
+          <w:tcPr>
+            <w:tcW w:w="1900" w:type="dxa"/>
+            <w:vAlign w:val="top"/>
+          </w:tcPr>
+          <w:p>
+            <w:pPr>
+              <w:spacing w:after="0"/>
+            </w:pPr>
+            <w:r>
+              <w:rPr>
+                <w:rFonts w:ascii="Arial" w:hAnsi="Arial" w:eastAsia="Microsoft YaHei"/>
+                <w:sz w:val="18"/>
+              </w:rPr>
+              <w:t xml:space="preserve">78%</w:t>
+            </w:r>
+          </w:p>
+        </w:tc>
+        <w:tc>
+          <w:tcPr>
+            <w:tcW w:w="1400" w:type="dxa"/>
+            <w:vAlign w:val="top"/>
+          </w:tcPr>
+          <w:p>
+            <w:pPr>
+              <w:spacing w:after="0"/>
+            </w:pPr>
+            <w:r>
+              <w:rPr>
+                <w:rFonts w:ascii="Arial" w:hAnsi="Arial" w:eastAsia="Microsoft YaHei"/>
+                <w:sz w:val="18"/>
+              </w:rPr>
+              <w:t xml:space="preserve">0%</w:t>
+            </w:r>
+          </w:p>
+        </w:tc>
+        <w:tc>
+          <w:tcPr>
+            <w:tcW w:w="1700" w:type="dxa"/>
+            <w:vAlign w:val="top"/>
+          </w:tcPr>
+          <w:p>
+            <w:pPr>
+              <w:spacing w:after="0"/>
+            </w:pPr>
+            <w:r>
+              <w:rPr>
+                <w:rFonts w:ascii="Arial" w:hAnsi="Arial" w:eastAsia="Microsoft YaHei"/>
+                <w:sz w:val="18"/>
+              </w:rPr>
+              <w:t xml:space="preserve">0%</w:t>
+            </w:r>
+          </w:p>
+        </w:tc>
+        <w:tc>
+          <w:tcPr>
+            <w:tcW w:w="6900" w:type="dxa"/>
+            <w:vAlign w:val="top"/>
+          </w:tcPr>
+          <w:p>
+            <w:pPr>
+              <w:spacing w:after="0"/>
+            </w:pPr>
+            <w:r>
+              <w:rPr>
+                <w:rFonts w:ascii="Arial" w:hAnsi="Arial" w:eastAsia="Microsoft YaHei"/>
+                <w:sz w:val="18"/>
+              </w:rPr>
+              <w:t xml:space="preserve">未提供真实历史行为数据；理性概率仍是模型先验，承诺和反应判断需要打折。</w:t>
+            </w:r>
+          </w:p>
+        </w:tc>
+      </w:tr>
+    </w:tbl>
+    <w:p>
+      <w:pPr>
+        <w:spacing w:before="220" w:after="100"/>
+      </w:pPr>
+      <w:r>
+        <w:rPr>
+          <w:rFonts w:ascii="Arial" w:hAnsi="Arial" w:eastAsia="Microsoft YaHei"/>
+          <w:b/>
+          <w:sz w:val="26"/>
+        </w:rPr>
+        <w:t xml:space="preserve">真实历史行为样本</w:t>
+      </w:r>
+    </w:p>
+    <w:tbl>
+      <w:tblPr>
+        <w:tblW w:w="15400" w:type="dxa"/>
+        <w:tblLayout w:type="fixed"/>
+        <w:tblBorders>
+          <w:top w:val="single" w:sz="4" w:color="D9E0D8"/>
+          <w:left w:val="single" w:sz="4" w:color="D9E0D8"/>
+          <w:bottom w:val="single" w:sz="4" w:color="D9E0D8"/>
+          <w:right w:val="single" w:sz="4" w:color="D9E0D8"/>
+          <w:insideH w:val="single" w:sz="4" w:color="D9E0D8"/>
+          <w:insideV w:val="single" w:sz="4" w:color="D9E0D8"/>
+        </w:tblBorders>
+        <w:tblCellMar>
+          <w:top w:w="80" w:type="dxa"/>
+          <w:left w:w="80" w:type="dxa"/>
+          <w:bottom w:w="80" w:type="dxa"/>
+          <w:right w:w="80" w:type="dxa"/>
+        </w:tblCellMar>
+      </w:tblPr>
+      <w:tblGrid>
+        <w:gridCol w:w="1400"/>
+        <w:gridCol w:w="4200"/>
+        <w:gridCol w:w="2200"/>
+        <w:gridCol w:w="1200"/>
+        <w:gridCol w:w="1200"/>
+        <w:gridCol w:w="2200"/>
+        <w:gridCol w:w="3000"/>
+      </w:tblGrid>
+      <w:tr>
+        <w:tc>
+          <w:tcPr>
+            <w:tcW w:w="1400" w:type="dxa"/>
+            <w:vAlign w:val="top"/>
+          </w:tcPr>
+          <w:p>
+            <w:pPr>
+              <w:spacing w:after="0"/>
+            </w:pPr>
+            <w:r>
+              <w:rPr>
+                <w:rFonts w:ascii="Arial" w:hAnsi="Arial" w:eastAsia="Microsoft YaHei"/>
+                <w:sz w:val="18"/>
+                <w:b/>
+              </w:rPr>
+              <w:t xml:space="preserve">玩家</w:t>
+            </w:r>
+          </w:p>
+        </w:tc>
+        <w:tc>
+          <w:tcPr>
+            <w:tcW w:w="4200" w:type="dxa"/>
+            <w:vAlign w:val="top"/>
+          </w:tcPr>
+          <w:p>
+            <w:pPr>
+              <w:spacing w:after="0"/>
+            </w:pPr>
+            <w:r>
+              <w:rPr>
+                <w:rFonts w:ascii="Arial" w:hAnsi="Arial" w:eastAsia="Microsoft YaHei"/>
+                <w:sz w:val="18"/>
+                <w:b/>
+              </w:rPr>
+              <w:t xml:space="preserve">历史事件</w:t>
+            </w:r>
+          </w:p>
+        </w:tc>
+        <w:tc>
+          <w:tcPr>
+            <w:tcW w:w="2200" w:type="dxa"/>
+            <w:vAlign w:val="top"/>
+          </w:tcPr>
+          <w:p>
+            <w:pPr>
+              <w:spacing w:after="0"/>
+            </w:pPr>
+            <w:r>
+              <w:rPr>
+                <w:rFonts w:ascii="Arial" w:hAnsi="Arial" w:eastAsia="Microsoft YaHei"/>
+                <w:sz w:val="18"/>
+                <w:b/>
+              </w:rPr>
+              <w:t xml:space="preserve">观察动作</w:t>
+            </w:r>
+          </w:p>
+        </w:tc>
+        <w:tc>
+          <w:tcPr>
+            <w:tcW w:w="1200" w:type="dxa"/>
+            <w:vAlign w:val="top"/>
+          </w:tcPr>
+          <w:p>
+            <w:pPr>
+              <w:spacing w:after="0"/>
+            </w:pPr>
+            <w:r>
+              <w:rPr>
+                <w:rFonts w:ascii="Arial" w:hAnsi="Arial" w:eastAsia="Microsoft YaHei"/>
+                <w:sz w:val="18"/>
+                <w:b/>
+              </w:rPr>
+              <w:t xml:space="preserve">相似度</w:t>
+            </w:r>
+          </w:p>
+        </w:tc>
+        <w:tc>
+          <w:tcPr>
+            <w:tcW w:w="1200" w:type="dxa"/>
+            <w:vAlign w:val="top"/>
+          </w:tcPr>
+          <w:p>
+            <w:pPr>
+              <w:spacing w:after="0"/>
+            </w:pPr>
+            <w:r>
+              <w:rPr>
+                <w:rFonts w:ascii="Arial" w:hAnsi="Arial" w:eastAsia="Microsoft YaHei"/>
+                <w:sz w:val="18"/>
+                <w:b/>
+              </w:rPr>
+              <w:t xml:space="preserve">兑现率</w:t>
+            </w:r>
+          </w:p>
+        </w:tc>
+        <w:tc>
+          <w:tcPr>
+            <w:tcW w:w="2200" w:type="dxa"/>
+            <w:vAlign w:val="top"/>
+          </w:tcPr>
+          <w:p>
+            <w:pPr>
+              <w:spacing w:after="0"/>
+            </w:pPr>
+            <w:r>
+              <w:rPr>
+                <w:rFonts w:ascii="Arial" w:hAnsi="Arial" w:eastAsia="Microsoft YaHei"/>
+                <w:sz w:val="18"/>
+                <w:b/>
+              </w:rPr>
+              <w:t xml:space="preserve">来源</w:t>
+            </w:r>
+          </w:p>
+        </w:tc>
+        <w:tc>
+          <w:tcPr>
+            <w:tcW w:w="3000" w:type="dxa"/>
+            <w:vAlign w:val="top"/>
+          </w:tcPr>
+          <w:p>
+            <w:pPr>
+              <w:spacing w:after="0"/>
+            </w:pPr>
+            <w:r>
+              <w:rPr>
+                <w:rFonts w:ascii="Arial" w:hAnsi="Arial" w:eastAsia="Microsoft YaHei"/>
+                <w:sz w:val="18"/>
+                <w:b/>
+              </w:rPr>
+              <w:t xml:space="preserve">启发</w:t>
+            </w:r>
+          </w:p>
+        </w:tc>
+      </w:tr>
+      <w:tr>
+        <w:tc>
+          <w:tcPr>
+            <w:tcW w:w="1400" w:type="dxa"/>
+            <w:vAlign w:val="top"/>
+          </w:tcPr>
+          <w:p>
+            <w:pPr>
+              <w:spacing w:after="0"/>
+            </w:pPr>
+            <w:r>
+              <w:rPr>
+                <w:rFonts w:ascii="Arial" w:hAnsi="Arial" w:eastAsia="Microsoft YaHei"/>
+                <w:sz w:val="18"/>
+              </w:rPr>
+              <w:t xml:space="preserve">头部竞品</w:t>
+            </w:r>
+          </w:p>
+        </w:tc>
+        <w:tc>
+          <w:tcPr>
+            <w:tcW w:w="4200" w:type="dxa"/>
+            <w:vAlign w:val="top"/>
+          </w:tcPr>
+          <w:p>
+            <w:pPr>
+              <w:spacing w:after="0"/>
+            </w:pPr>
+            <w:r>
+              <w:rPr>
+                <w:rFonts w:ascii="Arial" w:hAnsi="Arial" w:eastAsia="Microsoft YaHei"/>
+                <w:sz w:val="18"/>
+              </w:rPr>
+              <w:t xml:space="preserve">上一轮区域价格战中，竞品公开威胁长期低价，但 6 周后恢复价格并收窄折扣。</w:t>
+            </w:r>
+          </w:p>
+        </w:tc>
+        <w:tc>
+          <w:tcPr>
+            <w:tcW w:w="2200" w:type="dxa"/>
+            <w:vAlign w:val="top"/>
+          </w:tcPr>
+          <w:p>
+            <w:pPr>
+              <w:spacing w:after="0"/>
+            </w:pPr>
+            <w:r>
+              <w:rPr>
+                <w:rFonts w:ascii="Arial" w:hAnsi="Arial" w:eastAsia="Microsoft YaHei"/>
+                <w:sz w:val="18"/>
+              </w:rPr>
+              <w:t xml:space="preserve">cheap_talk_then_reversal</w:t>
+            </w:r>
+          </w:p>
+        </w:tc>
+        <w:tc>
+          <w:tcPr>
+            <w:tcW w:w="1200" w:type="dxa"/>
+            <w:vAlign w:val="top"/>
+          </w:tcPr>
+          <w:p>
+            <w:pPr>
+              <w:spacing w:after="0"/>
+            </w:pPr>
+            <w:r>
+              <w:rPr>
+                <w:rFonts w:ascii="Arial" w:hAnsi="Arial" w:eastAsia="Microsoft YaHei"/>
+                <w:sz w:val="18"/>
+              </w:rPr>
+              <w:t xml:space="preserve">82%</w:t>
+            </w:r>
+          </w:p>
+        </w:tc>
+        <w:tc>
+          <w:tcPr>
+            <w:tcW w:w="1200" w:type="dxa"/>
+            <w:vAlign w:val="top"/>
+          </w:tcPr>
+          <w:p>
+            <w:pPr>
+              <w:spacing w:after="0"/>
+            </w:pPr>
+            <w:r>
+              <w:rPr>
+                <w:rFonts w:ascii="Arial" w:hAnsi="Arial" w:eastAsia="Microsoft YaHei"/>
+                <w:sz w:val="18"/>
+              </w:rPr>
+              <w:t xml:space="preserve">25%</w:t>
+            </w:r>
+          </w:p>
+        </w:tc>
+        <w:tc>
+          <w:tcPr>
+            <w:tcW w:w="2200" w:type="dxa"/>
+            <w:vAlign w:val="top"/>
+          </w:tcPr>
+          <w:p>
+            <w:pPr>
+              <w:spacing w:after="0"/>
+            </w:pPr>
+            <w:r>
+              <w:rPr>
+                <w:rFonts w:ascii="Arial" w:hAnsi="Arial" w:eastAsia="Microsoft YaHei"/>
+                <w:sz w:val="18"/>
+              </w:rPr>
+              <w:t xml:space="preserve">销售 CRM 报价记录和渠道访谈</w:t>
+            </w:r>
+          </w:p>
+        </w:tc>
+        <w:tc>
+          <w:tcPr>
+            <w:tcW w:w="3000" w:type="dxa"/>
+            <w:vAlign w:val="top"/>
+          </w:tcPr>
+          <w:p>
+            <w:pPr>
+              <w:spacing w:after="0"/>
+            </w:pPr>
+            <w:r>
+              <w:rPr>
+                <w:rFonts w:ascii="Arial" w:hAnsi="Arial" w:eastAsia="Microsoft YaHei"/>
+                <w:sz w:val="18"/>
+              </w:rPr>
+              <w:t xml:space="preserve">不要把竞品长期低价威胁直接当成完全理性且时间一致的可信承诺。</w:t>
+            </w:r>
+          </w:p>
+        </w:tc>
+      </w:tr>
+      <w:tr>
+        <w:tc>
+          <w:tcPr>
+            <w:tcW w:w="1400" w:type="dxa"/>
+            <w:vAlign w:val="top"/>
+          </w:tcPr>
+          <w:p>
+            <w:pPr>
+              <w:spacing w:after="0"/>
+            </w:pPr>
+            <w:r>
+              <w:rPr>
+                <w:rFonts w:ascii="Arial" w:hAnsi="Arial" w:eastAsia="Microsoft YaHei"/>
+                <w:sz w:val="18"/>
+              </w:rPr>
+              <w:t xml:space="preserve">头部竞品</w:t>
+            </w:r>
+          </w:p>
+        </w:tc>
+        <w:tc>
+          <w:tcPr>
+            <w:tcW w:w="4200" w:type="dxa"/>
+            <w:vAlign w:val="top"/>
+          </w:tcPr>
+          <w:p>
+            <w:pPr>
+              <w:spacing w:after="0"/>
+            </w:pPr>
+            <w:r>
+              <w:rPr>
+                <w:rFonts w:ascii="Arial" w:hAnsi="Arial" w:eastAsia="Microsoft YaHei"/>
+                <w:sz w:val="18"/>
+              </w:rPr>
+              <w:t xml:space="preserve">过去两次免费版发布都带来短期线索噪音，但缺少持续交付资源，90 天后活跃度明显下降。</w:t>
+            </w:r>
+          </w:p>
+        </w:tc>
+        <w:tc>
+          <w:tcPr>
+            <w:tcW w:w="2200" w:type="dxa"/>
+            <w:vAlign w:val="top"/>
+          </w:tcPr>
+          <w:p>
+            <w:pPr>
+              <w:spacing w:after="0"/>
+            </w:pPr>
+            <w:r>
+              <w:rPr>
+                <w:rFonts w:ascii="Arial" w:hAnsi="Arial" w:eastAsia="Microsoft YaHei"/>
+                <w:sz w:val="18"/>
+              </w:rPr>
+              <w:t xml:space="preserve">free_tier_launch_with_low_follow_through</w:t>
+            </w:r>
+          </w:p>
+        </w:tc>
+        <w:tc>
+          <w:tcPr>
+            <w:tcW w:w="1200" w:type="dxa"/>
+            <w:vAlign w:val="top"/>
+          </w:tcPr>
+          <w:p>
+            <w:pPr>
+              <w:spacing w:after="0"/>
+            </w:pPr>
+            <w:r>
+              <w:rPr>
+                <w:rFonts w:ascii="Arial" w:hAnsi="Arial" w:eastAsia="Microsoft YaHei"/>
+                <w:sz w:val="18"/>
+              </w:rPr>
+              <w:t xml:space="preserve">76%</w:t>
+            </w:r>
+          </w:p>
+        </w:tc>
+        <w:tc>
+          <w:tcPr>
+            <w:tcW w:w="1200" w:type="dxa"/>
+            <w:vAlign w:val="top"/>
+          </w:tcPr>
+          <w:p>
+            <w:pPr>
+              <w:spacing w:after="0"/>
+            </w:pPr>
+            <w:r>
+              <w:rPr>
+                <w:rFonts w:ascii="Arial" w:hAnsi="Arial" w:eastAsia="Microsoft YaHei"/>
+                <w:sz w:val="18"/>
+              </w:rPr>
+              <w:t xml:space="preserve">35%</w:t>
+            </w:r>
+          </w:p>
+        </w:tc>
+        <w:tc>
+          <w:tcPr>
+            <w:tcW w:w="2200" w:type="dxa"/>
+            <w:vAlign w:val="top"/>
+          </w:tcPr>
+          <w:p>
+            <w:pPr>
+              <w:spacing w:after="0"/>
+            </w:pPr>
+            <w:r>
+              <w:rPr>
+                <w:rFonts w:ascii="Arial" w:hAnsi="Arial" w:eastAsia="Microsoft YaHei"/>
+                <w:sz w:val="18"/>
+              </w:rPr>
+              <w:t xml:space="preserve">渠道复盘、公开产品更新和客户迁移记录</w:t>
+            </w:r>
+          </w:p>
+        </w:tc>
+        <w:tc>
+          <w:tcPr>
+            <w:tcW w:w="3000" w:type="dxa"/>
+            <w:vAlign w:val="top"/>
+          </w:tcPr>
+          <w:p>
+            <w:pPr>
+              <w:spacing w:after="0"/>
+            </w:pPr>
+            <w:r>
+              <w:rPr>
+                <w:rFonts w:ascii="Arial" w:hAnsi="Arial" w:eastAsia="Microsoft YaHei"/>
+                <w:sz w:val="18"/>
+              </w:rPr>
+              <w:t xml:space="preserve">免费版可能是战术压制信号，不应默认其会长期理性投入。</w:t>
+            </w:r>
+          </w:p>
+        </w:tc>
+      </w:tr>
+    </w:tbl>
+    <w:p>
+      <w:pPr>
+        <w:spacing w:before="220" w:after="100"/>
+      </w:pPr>
+      <w:r>
+        <w:rPr>
+          <w:rFonts w:ascii="Arial" w:hAnsi="Arial" w:eastAsia="Microsoft YaHei"/>
+          <w:b/>
+          <w:sz w:val="26"/>
+        </w:rPr>
+        <w:t xml:space="preserve">经验参考分析</w:t>
+      </w:r>
+    </w:p>
+    <w:tbl>
+      <w:tblPr>
+        <w:tblW w:w="15400" w:type="dxa"/>
+        <w:tblLayout w:type="fixed"/>
+        <w:tblBorders>
+          <w:top w:val="single" w:sz="4" w:color="D9E0D8"/>
+          <w:left w:val="single" w:sz="4" w:color="D9E0D8"/>
+          <w:bottom w:val="single" w:sz="4" w:color="D9E0D8"/>
+          <w:right w:val="single" w:sz="4" w:color="D9E0D8"/>
+          <w:insideH w:val="single" w:sz="4" w:color="D9E0D8"/>
+          <w:insideV w:val="single" w:sz="4" w:color="D9E0D8"/>
+        </w:tblBorders>
+        <w:tblCellMar>
+          <w:top w:w="80" w:type="dxa"/>
+          <w:left w:w="80" w:type="dxa"/>
+          <w:bottom w:w="80" w:type="dxa"/>
+          <w:right w:w="80" w:type="dxa"/>
+        </w:tblCellMar>
+      </w:tblPr>
+      <w:tblGrid>
+        <w:gridCol w:w="3000"/>
+        <w:gridCol w:w="5200"/>
+        <w:gridCol w:w="1700"/>
+        <w:gridCol w:w="1500"/>
+        <w:gridCol w:w="4000"/>
+      </w:tblGrid>
+      <w:tr>
+        <w:tc>
+          <w:tcPr>
+            <w:tcW w:w="3000" w:type="dxa"/>
+            <w:vAlign w:val="top"/>
+          </w:tcPr>
+          <w:p>
+            <w:pPr>
+              <w:spacing w:after="0"/>
+            </w:pPr>
+            <w:r>
+              <w:rPr>
+                <w:rFonts w:ascii="Arial" w:hAnsi="Arial" w:eastAsia="Microsoft YaHei"/>
+                <w:sz w:val="18"/>
+                <w:b/>
+              </w:rPr>
+              <w:t xml:space="preserve">参考类</w:t>
+            </w:r>
+          </w:p>
+        </w:tc>
+        <w:tc>
+          <w:tcPr>
+            <w:tcW w:w="5200" w:type="dxa"/>
+            <w:vAlign w:val="top"/>
+          </w:tcPr>
+          <w:p>
+            <w:pPr>
+              <w:spacing w:after="0"/>
+            </w:pPr>
+            <w:r>
+              <w:rPr>
+                <w:rFonts w:ascii="Arial" w:hAnsi="Arial" w:eastAsia="Microsoft YaHei"/>
+                <w:sz w:val="18"/>
+                <w:b/>
+              </w:rPr>
+              <w:t xml:space="preserve">模式</w:t>
+            </w:r>
+          </w:p>
+        </w:tc>
+        <w:tc>
+          <w:tcPr>
+            <w:tcW w:w="1700" w:type="dxa"/>
+            <w:vAlign w:val="top"/>
+          </w:tcPr>
+          <w:p>
+            <w:pPr>
+              <w:spacing w:after="0"/>
+            </w:pPr>
+            <w:r>
+              <w:rPr>
+                <w:rFonts w:ascii="Arial" w:hAnsi="Arial" w:eastAsia="Microsoft YaHei"/>
+                <w:sz w:val="18"/>
+                <w:b/>
+              </w:rPr>
+              <w:t xml:space="preserve">理性调整</w:t>
+            </w:r>
+          </w:p>
+        </w:tc>
+        <w:tc>
+          <w:tcPr>
+            <w:tcW w:w="1500" w:type="dxa"/>
+            <w:vAlign w:val="top"/>
+          </w:tcPr>
+          <w:p>
+            <w:pPr>
+              <w:spacing w:after="0"/>
+            </w:pPr>
+            <w:r>
+              <w:rPr>
+                <w:rFonts w:ascii="Arial" w:hAnsi="Arial" w:eastAsia="Microsoft YaHei"/>
+                <w:sz w:val="18"/>
+                <w:b/>
+              </w:rPr>
+              <w:t xml:space="preserve">置信度</w:t>
+            </w:r>
+          </w:p>
+        </w:tc>
+        <w:tc>
+          <w:tcPr>
+            <w:tcW w:w="4000" w:type="dxa"/>
+            <w:vAlign w:val="top"/>
+          </w:tcPr>
+          <w:p>
+            <w:pPr>
+              <w:spacing w:after="0"/>
+            </w:pPr>
+            <w:r>
+              <w:rPr>
+                <w:rFonts w:ascii="Arial" w:hAnsi="Arial" w:eastAsia="Microsoft YaHei"/>
+                <w:sz w:val="18"/>
+                <w:b/>
+              </w:rPr>
+              <w:t xml:space="preserve">启发</w:t>
+            </w:r>
+          </w:p>
+        </w:tc>
+      </w:tr>
+      <w:tr>
+        <w:tc>
+          <w:tcPr>
+            <w:tcW w:w="3000" w:type="dxa"/>
+            <w:vAlign w:val="top"/>
+          </w:tcPr>
+          <w:p>
+            <w:pPr>
+              <w:spacing w:after="0"/>
+            </w:pPr>
+            <w:r>
+              <w:rPr>
+                <w:rFonts w:ascii="Arial" w:hAnsi="Arial" w:eastAsia="Microsoft YaHei"/>
+                <w:sz w:val="18"/>
+              </w:rPr>
+              <w:t xml:space="preserve">同类 SaaS 渠道价格战</w:t>
+            </w:r>
+          </w:p>
+        </w:tc>
+        <w:tc>
+          <w:tcPr>
+            <w:tcW w:w="5200" w:type="dxa"/>
+            <w:vAlign w:val="top"/>
+          </w:tcPr>
+          <w:p>
+            <w:pPr>
+              <w:spacing w:after="0"/>
+            </w:pPr>
+            <w:r>
+              <w:rPr>
+                <w:rFonts w:ascii="Arial" w:hAnsi="Arial" w:eastAsia="Microsoft YaHei"/>
+                <w:sz w:val="18"/>
+              </w:rPr>
+              <w:t xml:space="preserve">头部竞品常用免费版或低价话术制造短期噪音，但持续兑现受毛利和交付成本约束。</w:t>
+            </w:r>
+          </w:p>
+        </w:tc>
+        <w:tc>
+          <w:tcPr>
+            <w:tcW w:w="1700" w:type="dxa"/>
+            <w:vAlign w:val="top"/>
+          </w:tcPr>
+          <w:p>
+            <w:pPr>
+              <w:spacing w:after="0"/>
+            </w:pPr>
+            <w:r>
+              <w:rPr>
+                <w:rFonts w:ascii="Arial" w:hAnsi="Arial" w:eastAsia="Microsoft YaHei"/>
+                <w:sz w:val="18"/>
+              </w:rPr>
+              <w:t xml:space="preserve">-14%</w:t>
+            </w:r>
+          </w:p>
+        </w:tc>
+        <w:tc>
+          <w:tcPr>
+            <w:tcW w:w="1500" w:type="dxa"/>
+            <w:vAlign w:val="top"/>
+          </w:tcPr>
+          <w:p>
+            <w:pPr>
+              <w:spacing w:after="0"/>
+            </w:pPr>
+            <w:r>
+              <w:rPr>
+                <w:rFonts w:ascii="Arial" w:hAnsi="Arial" w:eastAsia="Microsoft YaHei"/>
+                <w:sz w:val="18"/>
+              </w:rPr>
+              <w:t xml:space="preserve">72%</w:t>
+            </w:r>
+          </w:p>
+        </w:tc>
+        <w:tc>
+          <w:tcPr>
+            <w:tcW w:w="4000" w:type="dxa"/>
+            <w:vAlign w:val="top"/>
+          </w:tcPr>
+          <w:p>
+            <w:pPr>
+              <w:spacing w:after="0"/>
+            </w:pPr>
+            <w:r>
+              <w:rPr>
+                <w:rFonts w:ascii="Arial" w:hAnsi="Arial" w:eastAsia="Microsoft YaHei"/>
+                <w:sz w:val="18"/>
+              </w:rPr>
+              <w:t xml:space="preserve">下调其长期执行免费版/低价策略的理性概率，保留短期攻击渠道的风险。</w:t>
             </w:r>
           </w:p>
         </w:tc>
@@ -862,7 +2079,7 @@
           <w:rFonts w:ascii="Arial" w:hAnsi="Arial" w:eastAsia="Microsoft YaHei"/>
           <w:sz w:val="20"/>
         </w:rPr>
-        <w:t xml:space="preserve">最危险假设：主推荐与备选方案的预期收益差距较小，少量 payoff 调整就可能改变排序。</w:t>
+        <w:t xml:space="preserve">最危险假设：可能高估「头部竞品」的完全理性和时间一致性；真实历史行为要求下调其长期承诺或威胁可信度。</w:t>
       </w:r>
     </w:p>
     <w:tbl>
@@ -1186,6 +2403,80 @@
                 <w:sz w:val="18"/>
               </w:rPr>
               <w:t xml:space="preserve">需要先补强可观察投入，再正式推进绑定。</w:t>
+            </w:r>
+          </w:p>
+        </w:tc>
+      </w:tr>
+      <w:tr>
+        <w:tc>
+          <w:tcPr>
+            <w:tcW w:w="2500" w:type="dxa"/>
+            <w:vAlign w:val="top"/>
+          </w:tcPr>
+          <w:p>
+            <w:pPr>
+              <w:spacing w:after="0"/>
+            </w:pPr>
+            <w:r>
+              <w:rPr>
+                <w:rFonts w:ascii="Arial" w:hAnsi="Arial" w:eastAsia="Microsoft YaHei"/>
+                <w:sz w:val="18"/>
+              </w:rPr>
+              <w:t xml:space="preserve">对手理性程度下调</w:t>
+            </w:r>
+          </w:p>
+        </w:tc>
+        <w:tc>
+          <w:tcPr>
+            <w:tcW w:w="4500" w:type="dxa"/>
+            <w:vAlign w:val="top"/>
+          </w:tcPr>
+          <w:p>
+            <w:pPr>
+              <w:spacing w:after="0"/>
+            </w:pPr>
+            <w:r>
+              <w:rPr>
+                <w:rFonts w:ascii="Arial" w:hAnsi="Arial" w:eastAsia="Microsoft YaHei"/>
+                <w:sz w:val="18"/>
+              </w:rPr>
+              <w:t xml:space="preserve">用真实历史行为替代模型默认理性假设。</w:t>
+            </w:r>
+          </w:p>
+        </w:tc>
+        <w:tc>
+          <w:tcPr>
+            <w:tcW w:w="4200" w:type="dxa"/>
+            <w:vAlign w:val="top"/>
+          </w:tcPr>
+          <w:p>
+            <w:pPr>
+              <w:spacing w:after="0"/>
+            </w:pPr>
+            <w:r>
+              <w:rPr>
+                <w:rFonts w:ascii="Arial" w:hAnsi="Arial" w:eastAsia="Microsoft YaHei"/>
+                <w:sz w:val="18"/>
+              </w:rPr>
+              <w:t xml:space="preserve">长期低价、免费版持续投入或公开威胁可能更像战术噪音，而非时间一致承诺。</w:t>
+            </w:r>
+          </w:p>
+        </w:tc>
+        <w:tc>
+          <w:tcPr>
+            <w:tcW w:w="4200" w:type="dxa"/>
+            <w:vAlign w:val="top"/>
+          </w:tcPr>
+          <w:p>
+            <w:pPr>
+              <w:spacing w:after="0"/>
+            </w:pPr>
+            <w:r>
+              <w:rPr>
+                <w:rFonts w:ascii="Arial" w:hAnsi="Arial" w:eastAsia="Microsoft YaHei"/>
+                <w:sz w:val="18"/>
+              </w:rPr>
+              <w:t xml:space="preserve">降低对方持续威胁可信度，但仍保留短期扰动和渠道舆论风险。</w:t>
             </w:r>
           </w:p>
         </w:tc>
@@ -4160,17 +5451,18 @@
         </w:tblCellMar>
       </w:tblPr>
       <w:tblGrid>
-        <w:gridCol w:w="1900"/>
-        <w:gridCol w:w="3300"/>
         <w:gridCol w:w="1700"/>
-        <w:gridCol w:w="1300"/>
-        <w:gridCol w:w="1800"/>
-        <w:gridCol w:w="5400"/>
+        <w:gridCol w:w="2600"/>
+        <w:gridCol w:w="1500"/>
+        <w:gridCol w:w="1400"/>
+        <w:gridCol w:w="1600"/>
+        <w:gridCol w:w="1600"/>
+        <w:gridCol w:w="5000"/>
       </w:tblGrid>
       <w:tr>
         <w:tc>
           <w:tcPr>
-            <w:tcW w:w="1900" w:type="dxa"/>
+            <w:tcW w:w="1700" w:type="dxa"/>
             <w:vAlign w:val="top"/>
           </w:tcPr>
           <w:p>
@@ -4189,7 +5481,7 @@
         </w:tc>
         <w:tc>
           <w:tcPr>
-            <w:tcW w:w="3300" w:type="dxa"/>
+            <w:tcW w:w="2600" w:type="dxa"/>
             <w:vAlign w:val="top"/>
           </w:tcPr>
           <w:p>
@@ -4208,7 +5500,7 @@
         </w:tc>
         <w:tc>
           <w:tcPr>
-            <w:tcW w:w="1700" w:type="dxa"/>
+            <w:tcW w:w="1500" w:type="dxa"/>
             <w:vAlign w:val="top"/>
           </w:tcPr>
           <w:p>
@@ -4227,7 +5519,7 @@
         </w:tc>
         <w:tc>
           <w:tcPr>
-            <w:tcW w:w="1300" w:type="dxa"/>
+            <w:tcW w:w="1400" w:type="dxa"/>
             <w:vAlign w:val="top"/>
           </w:tcPr>
           <w:p>
@@ -4240,13 +5532,13 @@
                 <w:sz w:val="18"/>
                 <w:b/>
               </w:rPr>
-              <w:t xml:space="preserve">评分</w:t>
-            </w:r>
-          </w:p>
-        </w:tc>
-        <w:tc>
-          <w:tcPr>
-            <w:tcW w:w="1800" w:type="dxa"/>
+              <w:t xml:space="preserve">原始评分</w:t>
+            </w:r>
+          </w:p>
+        </w:tc>
+        <w:tc>
+          <w:tcPr>
+            <w:tcW w:w="1600" w:type="dxa"/>
             <w:vAlign w:val="top"/>
           </w:tcPr>
           <w:p>
@@ -4259,13 +5551,32 @@
                 <w:sz w:val="18"/>
                 <w:b/>
               </w:rPr>
+              <w:t xml:space="preserve">历史校正</w:t>
+            </w:r>
+          </w:p>
+        </w:tc>
+        <w:tc>
+          <w:tcPr>
+            <w:tcW w:w="1600" w:type="dxa"/>
+            <w:vAlign w:val="top"/>
+          </w:tcPr>
+          <w:p>
+            <w:pPr>
+              <w:spacing w:after="0"/>
+            </w:pPr>
+            <w:r>
+              <w:rPr>
+                <w:rFonts w:ascii="Arial" w:hAnsi="Arial" w:eastAsia="Microsoft YaHei"/>
+                <w:sz w:val="18"/>
+                <w:b/>
+              </w:rPr>
               <w:t xml:space="preserve">证据基础</w:t>
             </w:r>
           </w:p>
         </w:tc>
         <w:tc>
           <w:tcPr>
-            <w:tcW w:w="5400" w:type="dxa"/>
+            <w:tcW w:w="5000" w:type="dxa"/>
             <w:vAlign w:val="top"/>
           </w:tcPr>
           <w:p>
@@ -4278,7 +5589,7 @@
                 <w:sz w:val="18"/>
                 <w:b/>
               </w:rPr>
-              <w:t xml:space="preserve">说明</w:t>
+              <w:t xml:space="preserve">历史校正说明</w:t>
             </w:r>
           </w:p>
         </w:tc>
@@ -4286,42 +5597,6 @@
       <w:tr>
         <w:tc>
           <w:tcPr>
-            <w:tcW w:w="1900" w:type="dxa"/>
-            <w:vAlign w:val="top"/>
-          </w:tcPr>
-          <w:p>
-            <w:pPr>
-              <w:spacing w:after="0"/>
-            </w:pPr>
-            <w:r>
-              <w:rPr>
-                <w:rFonts w:ascii="Arial" w:hAnsi="Arial" w:eastAsia="Microsoft YaHei"/>
-                <w:sz w:val="18"/>
-              </w:rPr>
-              <w:t xml:space="preserve">捆绑渠道</w:t>
-            </w:r>
-          </w:p>
-        </w:tc>
-        <w:tc>
-          <w:tcPr>
-            <w:tcW w:w="3300" w:type="dxa"/>
-            <w:vAlign w:val="top"/>
-          </w:tcPr>
-          <w:p>
-            <w:pPr>
-              <w:spacing w:after="0"/>
-            </w:pPr>
-            <w:r>
-              <w:rPr>
-                <w:rFonts w:ascii="Arial" w:hAnsi="Arial" w:eastAsia="Microsoft YaHei"/>
-                <w:sz w:val="18"/>
-              </w:rPr>
-              <w:t xml:space="preserve">年度渠道合作包</w:t>
-            </w:r>
-          </w:p>
-        </w:tc>
-        <w:tc>
-          <w:tcPr>
             <w:tcW w:w="1700" w:type="dxa"/>
             <w:vAlign w:val="top"/>
           </w:tcPr>
@@ -4334,31 +5609,85 @@
                 <w:rFonts w:ascii="Arial" w:hAnsi="Arial" w:eastAsia="Microsoft YaHei"/>
                 <w:sz w:val="18"/>
               </w:rPr>
-              <w:t xml:space="preserve">可信</w:t>
-            </w:r>
-          </w:p>
-        </w:tc>
-        <w:tc>
-          <w:tcPr>
-            <w:tcW w:w="1300" w:type="dxa"/>
-            <w:vAlign w:val="top"/>
-          </w:tcPr>
-          <w:p>
-            <w:pPr>
-              <w:spacing w:after="0"/>
-            </w:pPr>
-            <w:r>
-              <w:rPr>
-                <w:rFonts w:ascii="Arial" w:hAnsi="Arial" w:eastAsia="Microsoft YaHei"/>
-                <w:sz w:val="18"/>
-              </w:rPr>
-              <w:t xml:space="preserve">79%</w:t>
-            </w:r>
-          </w:p>
-        </w:tc>
-        <w:tc>
-          <w:tcPr>
-            <w:tcW w:w="1800" w:type="dxa"/>
+              <w:t xml:space="preserve">跟随降价</w:t>
+            </w:r>
+          </w:p>
+        </w:tc>
+        <w:tc>
+          <w:tcPr>
+            <w:tcW w:w="2600" w:type="dxa"/>
+            <w:vAlign w:val="top"/>
+          </w:tcPr>
+          <w:p>
+            <w:pPr>
+              <w:spacing w:after="0"/>
+            </w:pPr>
+            <w:r>
+              <w:rPr>
+                <w:rFonts w:ascii="Arial" w:hAnsi="Arial" w:eastAsia="Microsoft YaHei"/>
+                <w:sz w:val="18"/>
+              </w:rPr>
+              <w:t xml:space="preserve">长期低价威胁</w:t>
+            </w:r>
+          </w:p>
+        </w:tc>
+        <w:tc>
+          <w:tcPr>
+            <w:tcW w:w="1500" w:type="dxa"/>
+            <w:vAlign w:val="top"/>
+          </w:tcPr>
+          <w:p>
+            <w:pPr>
+              <w:spacing w:after="0"/>
+            </w:pPr>
+            <w:r>
+              <w:rPr>
+                <w:rFonts w:ascii="Arial" w:hAnsi="Arial" w:eastAsia="Microsoft YaHei"/>
+                <w:sz w:val="18"/>
+              </w:rPr>
+              <w:t xml:space="preserve">部分可信</w:t>
+            </w:r>
+          </w:p>
+        </w:tc>
+        <w:tc>
+          <w:tcPr>
+            <w:tcW w:w="1400" w:type="dxa"/>
+            <w:vAlign w:val="top"/>
+          </w:tcPr>
+          <w:p>
+            <w:pPr>
+              <w:spacing w:after="0"/>
+            </w:pPr>
+            <w:r>
+              <w:rPr>
+                <w:rFonts w:ascii="Arial" w:hAnsi="Arial" w:eastAsia="Microsoft YaHei"/>
+                <w:sz w:val="18"/>
+              </w:rPr>
+              <w:t xml:space="preserve">65%</w:t>
+            </w:r>
+          </w:p>
+        </w:tc>
+        <w:tc>
+          <w:tcPr>
+            <w:tcW w:w="1600" w:type="dxa"/>
+            <w:vAlign w:val="top"/>
+          </w:tcPr>
+          <w:p>
+            <w:pPr>
+              <w:spacing w:after="0"/>
+            </w:pPr>
+            <w:r>
+              <w:rPr>
+                <w:rFonts w:ascii="Arial" w:hAnsi="Arial" w:eastAsia="Microsoft YaHei"/>
+                <w:sz w:val="18"/>
+              </w:rPr>
+              <w:t xml:space="preserve">50%</w:t>
+            </w:r>
+          </w:p>
+        </w:tc>
+        <w:tc>
+          <w:tcPr>
+            <w:tcW w:w="1600" w:type="dxa"/>
             <w:vAlign w:val="top"/>
           </w:tcPr>
           <w:p>
@@ -4376,19 +5705,19 @@
         </w:tc>
         <w:tc>
           <w:tcPr>
-            <w:tcW w:w="5400" w:type="dxa"/>
-            <w:vAlign w:val="top"/>
-          </w:tcPr>
-          <w:p>
-            <w:pPr>
-              <w:spacing w:after="0"/>
-            </w:pPr>
-            <w:r>
-              <w:rPr>
-                <w:rFonts w:ascii="Arial" w:hAnsi="Arial" w:eastAsia="Microsoft YaHei"/>
-                <w:sz w:val="18"/>
-              </w:rPr>
-              <w:t xml:space="preserve">返点、联合交付和客户线索投入会让渠道看见真实承诺，撤回成本也较高。</w:t>
+            <w:tcW w:w="5000" w:type="dxa"/>
+            <w:vAlign w:val="top"/>
+          </w:tcPr>
+          <w:p>
+            <w:pPr>
+              <w:spacing w:after="0"/>
+            </w:pPr>
+            <w:r>
+              <w:rPr>
+                <w:rFonts w:ascii="Arial" w:hAnsi="Arial" w:eastAsia="Microsoft YaHei"/>
+                <w:sz w:val="18"/>
+              </w:rPr>
+              <w:t xml:space="preserve">真实历史行为显示该玩家未必时间一致或完全理性，应下调其长期威胁、承诺或信号可信度。</w:t>
             </w:r>
           </w:p>
         </w:tc>
@@ -4396,42 +5725,6 @@
       <w:tr>
         <w:tc>
           <w:tcPr>
-            <w:tcW w:w="1900" w:type="dxa"/>
-            <w:vAlign w:val="top"/>
-          </w:tcPr>
-          <w:p>
-            <w:pPr>
-              <w:spacing w:after="0"/>
-            </w:pPr>
-            <w:r>
-              <w:rPr>
-                <w:rFonts w:ascii="Arial" w:hAnsi="Arial" w:eastAsia="Microsoft YaHei"/>
-                <w:sz w:val="18"/>
-              </w:rPr>
-              <w:t xml:space="preserve">高端差异化</w:t>
-            </w:r>
-          </w:p>
-        </w:tc>
-        <w:tc>
-          <w:tcPr>
-            <w:tcW w:w="3300" w:type="dxa"/>
-            <w:vAlign w:val="top"/>
-          </w:tcPr>
-          <w:p>
-            <w:pPr>
-              <w:spacing w:after="0"/>
-            </w:pPr>
-            <w:r>
-              <w:rPr>
-                <w:rFonts w:ascii="Arial" w:hAnsi="Arial" w:eastAsia="Microsoft YaHei"/>
-                <w:sz w:val="18"/>
-              </w:rPr>
-              <w:t xml:space="preserve">高端服务 SLA 与集成路线图</w:t>
-            </w:r>
-          </w:p>
-        </w:tc>
-        <w:tc>
-          <w:tcPr>
             <w:tcW w:w="1700" w:type="dxa"/>
             <w:vAlign w:val="top"/>
           </w:tcPr>
@@ -4444,31 +5737,85 @@
                 <w:rFonts w:ascii="Arial" w:hAnsi="Arial" w:eastAsia="Microsoft YaHei"/>
                 <w:sz w:val="18"/>
               </w:rPr>
-              <w:t xml:space="preserve">部分可信</w:t>
-            </w:r>
-          </w:p>
-        </w:tc>
-        <w:tc>
-          <w:tcPr>
-            <w:tcW w:w="1300" w:type="dxa"/>
-            <w:vAlign w:val="top"/>
-          </w:tcPr>
-          <w:p>
-            <w:pPr>
-              <w:spacing w:after="0"/>
-            </w:pPr>
-            <w:r>
-              <w:rPr>
-                <w:rFonts w:ascii="Arial" w:hAnsi="Arial" w:eastAsia="Microsoft YaHei"/>
-                <w:sz w:val="18"/>
-              </w:rPr>
-              <w:t xml:space="preserve">71%</w:t>
-            </w:r>
-          </w:p>
-        </w:tc>
-        <w:tc>
-          <w:tcPr>
-            <w:tcW w:w="1800" w:type="dxa"/>
+              <w:t xml:space="preserve">捆绑渠道</w:t>
+            </w:r>
+          </w:p>
+        </w:tc>
+        <w:tc>
+          <w:tcPr>
+            <w:tcW w:w="2600" w:type="dxa"/>
+            <w:vAlign w:val="top"/>
+          </w:tcPr>
+          <w:p>
+            <w:pPr>
+              <w:spacing w:after="0"/>
+            </w:pPr>
+            <w:r>
+              <w:rPr>
+                <w:rFonts w:ascii="Arial" w:hAnsi="Arial" w:eastAsia="Microsoft YaHei"/>
+                <w:sz w:val="18"/>
+              </w:rPr>
+              <w:t xml:space="preserve">年度渠道合作包</w:t>
+            </w:r>
+          </w:p>
+        </w:tc>
+        <w:tc>
+          <w:tcPr>
+            <w:tcW w:w="1500" w:type="dxa"/>
+            <w:vAlign w:val="top"/>
+          </w:tcPr>
+          <w:p>
+            <w:pPr>
+              <w:spacing w:after="0"/>
+            </w:pPr>
+            <w:r>
+              <w:rPr>
+                <w:rFonts w:ascii="Arial" w:hAnsi="Arial" w:eastAsia="Microsoft YaHei"/>
+                <w:sz w:val="18"/>
+              </w:rPr>
+              <w:t xml:space="preserve">可信</w:t>
+            </w:r>
+          </w:p>
+        </w:tc>
+        <w:tc>
+          <w:tcPr>
+            <w:tcW w:w="1400" w:type="dxa"/>
+            <w:vAlign w:val="top"/>
+          </w:tcPr>
+          <w:p>
+            <w:pPr>
+              <w:spacing w:after="0"/>
+            </w:pPr>
+            <w:r>
+              <w:rPr>
+                <w:rFonts w:ascii="Arial" w:hAnsi="Arial" w:eastAsia="Microsoft YaHei"/>
+                <w:sz w:val="18"/>
+              </w:rPr>
+              <w:t xml:space="preserve">79%</w:t>
+            </w:r>
+          </w:p>
+        </w:tc>
+        <w:tc>
+          <w:tcPr>
+            <w:tcW w:w="1600" w:type="dxa"/>
+            <w:vAlign w:val="top"/>
+          </w:tcPr>
+          <w:p>
+            <w:pPr>
+              <w:spacing w:after="0"/>
+            </w:pPr>
+            <w:r>
+              <w:rPr>
+                <w:rFonts w:ascii="Arial" w:hAnsi="Arial" w:eastAsia="Microsoft YaHei"/>
+                <w:sz w:val="18"/>
+              </w:rPr>
+              <w:t xml:space="preserve">79%</w:t>
+            </w:r>
+          </w:p>
+        </w:tc>
+        <w:tc>
+          <w:tcPr>
+            <w:tcW w:w="1600" w:type="dxa"/>
             <w:vAlign w:val="top"/>
           </w:tcPr>
           <w:p>
@@ -4486,19 +5833,19 @@
         </w:tc>
         <w:tc>
           <w:tcPr>
-            <w:tcW w:w="5400" w:type="dxa"/>
-            <w:vAlign w:val="top"/>
-          </w:tcPr>
-          <w:p>
-            <w:pPr>
-              <w:spacing w:after="0"/>
-            </w:pPr>
-            <w:r>
-              <w:rPr>
-                <w:rFonts w:ascii="Arial" w:hAnsi="Arial" w:eastAsia="Microsoft YaHei"/>
-                <w:sz w:val="18"/>
-              </w:rPr>
-              <w:t xml:space="preserve">若已绑定交付团队和路线图，承诺较可信；若只是发布话术，可信度会下降。</w:t>
+            <w:tcW w:w="5000" w:type="dxa"/>
+            <w:vAlign w:val="top"/>
+          </w:tcPr>
+          <w:p>
+            <w:pPr>
+              <w:spacing w:after="0"/>
+            </w:pPr>
+            <w:r>
+              <w:rPr>
+                <w:rFonts w:ascii="Arial" w:hAnsi="Arial" w:eastAsia="Microsoft YaHei"/>
+                <w:sz w:val="18"/>
+              </w:rPr>
+              <w:t xml:space="preserve">未提供真实历史行为数据；理性概率仍是模型先验，承诺和反应判断需要打折。</w:t>
             </w:r>
           </w:p>
         </w:tc>
@@ -4506,7 +5853,135 @@
       <w:tr>
         <w:tc>
           <w:tcPr>
-            <w:tcW w:w="1900" w:type="dxa"/>
+            <w:tcW w:w="1700" w:type="dxa"/>
+            <w:vAlign w:val="top"/>
+          </w:tcPr>
+          <w:p>
+            <w:pPr>
+              <w:spacing w:after="0"/>
+            </w:pPr>
+            <w:r>
+              <w:rPr>
+                <w:rFonts w:ascii="Arial" w:hAnsi="Arial" w:eastAsia="Microsoft YaHei"/>
+                <w:sz w:val="18"/>
+              </w:rPr>
+              <w:t xml:space="preserve">高端差异化</w:t>
+            </w:r>
+          </w:p>
+        </w:tc>
+        <w:tc>
+          <w:tcPr>
+            <w:tcW w:w="2600" w:type="dxa"/>
+            <w:vAlign w:val="top"/>
+          </w:tcPr>
+          <w:p>
+            <w:pPr>
+              <w:spacing w:after="0"/>
+            </w:pPr>
+            <w:r>
+              <w:rPr>
+                <w:rFonts w:ascii="Arial" w:hAnsi="Arial" w:eastAsia="Microsoft YaHei"/>
+                <w:sz w:val="18"/>
+              </w:rPr>
+              <w:t xml:space="preserve">高端服务 SLA 与集成路线图</w:t>
+            </w:r>
+          </w:p>
+        </w:tc>
+        <w:tc>
+          <w:tcPr>
+            <w:tcW w:w="1500" w:type="dxa"/>
+            <w:vAlign w:val="top"/>
+          </w:tcPr>
+          <w:p>
+            <w:pPr>
+              <w:spacing w:after="0"/>
+            </w:pPr>
+            <w:r>
+              <w:rPr>
+                <w:rFonts w:ascii="Arial" w:hAnsi="Arial" w:eastAsia="Microsoft YaHei"/>
+                <w:sz w:val="18"/>
+              </w:rPr>
+              <w:t xml:space="preserve">部分可信</w:t>
+            </w:r>
+          </w:p>
+        </w:tc>
+        <w:tc>
+          <w:tcPr>
+            <w:tcW w:w="1400" w:type="dxa"/>
+            <w:vAlign w:val="top"/>
+          </w:tcPr>
+          <w:p>
+            <w:pPr>
+              <w:spacing w:after="0"/>
+            </w:pPr>
+            <w:r>
+              <w:rPr>
+                <w:rFonts w:ascii="Arial" w:hAnsi="Arial" w:eastAsia="Microsoft YaHei"/>
+                <w:sz w:val="18"/>
+              </w:rPr>
+              <w:t xml:space="preserve">71%</w:t>
+            </w:r>
+          </w:p>
+        </w:tc>
+        <w:tc>
+          <w:tcPr>
+            <w:tcW w:w="1600" w:type="dxa"/>
+            <w:vAlign w:val="top"/>
+          </w:tcPr>
+          <w:p>
+            <w:pPr>
+              <w:spacing w:after="0"/>
+            </w:pPr>
+            <w:r>
+              <w:rPr>
+                <w:rFonts w:ascii="Arial" w:hAnsi="Arial" w:eastAsia="Microsoft YaHei"/>
+                <w:sz w:val="18"/>
+              </w:rPr>
+              <w:t xml:space="preserve">71%</w:t>
+            </w:r>
+          </w:p>
+        </w:tc>
+        <w:tc>
+          <w:tcPr>
+            <w:tcW w:w="1600" w:type="dxa"/>
+            <w:vAlign w:val="top"/>
+          </w:tcPr>
+          <w:p>
+            <w:pPr>
+              <w:spacing w:after="0"/>
+            </w:pPr>
+            <w:r>
+              <w:rPr>
+                <w:rFonts w:ascii="Arial" w:hAnsi="Arial" w:eastAsia="Microsoft YaHei"/>
+                <w:sz w:val="18"/>
+              </w:rPr>
+              <w:t xml:space="preserve">estimated</w:t>
+            </w:r>
+          </w:p>
+        </w:tc>
+        <w:tc>
+          <w:tcPr>
+            <w:tcW w:w="5000" w:type="dxa"/>
+            <w:vAlign w:val="top"/>
+          </w:tcPr>
+          <w:p>
+            <w:pPr>
+              <w:spacing w:after="0"/>
+            </w:pPr>
+            <w:r>
+              <w:rPr>
+                <w:rFonts w:ascii="Arial" w:hAnsi="Arial" w:eastAsia="Microsoft YaHei"/>
+                <w:sz w:val="18"/>
+              </w:rPr>
+              <w:t xml:space="preserve">未提供真实历史行为数据；理性概率仍是模型先验，承诺和反应判断需要打折。</w:t>
+            </w:r>
+          </w:p>
+        </w:tc>
+      </w:tr>
+      <w:tr>
+        <w:tc>
+          <w:tcPr>
+            <w:tcW w:w="1700" w:type="dxa"/>
             <w:vAlign w:val="top"/>
           </w:tcPr>
           <w:p>
@@ -4524,7 +5999,7 @@
         </w:tc>
         <w:tc>
           <w:tcPr>
-            <w:tcW w:w="3300" w:type="dxa"/>
+            <w:tcW w:w="2600" w:type="dxa"/>
             <w:vAlign w:val="top"/>
           </w:tcPr>
           <w:p>
@@ -4542,7 +6017,7 @@
         </w:tc>
         <w:tc>
           <w:tcPr>
-            <w:tcW w:w="1700" w:type="dxa"/>
+            <w:tcW w:w="1500" w:type="dxa"/>
             <w:vAlign w:val="top"/>
           </w:tcPr>
           <w:p>
@@ -4560,7 +6035,7 @@
         </w:tc>
         <w:tc>
           <w:tcPr>
-            <w:tcW w:w="1300" w:type="dxa"/>
+            <w:tcW w:w="1400" w:type="dxa"/>
             <w:vAlign w:val="top"/>
           </w:tcPr>
           <w:p>
@@ -4578,7 +6053,25 @@
         </w:tc>
         <w:tc>
           <w:tcPr>
-            <w:tcW w:w="1800" w:type="dxa"/>
+            <w:tcW w:w="1600" w:type="dxa"/>
+            <w:vAlign w:val="top"/>
+          </w:tcPr>
+          <w:p>
+            <w:pPr>
+              <w:spacing w:after="0"/>
+            </w:pPr>
+            <w:r>
+              <w:rPr>
+                <w:rFonts w:ascii="Arial" w:hAnsi="Arial" w:eastAsia="Microsoft YaHei"/>
+                <w:sz w:val="18"/>
+              </w:rPr>
+              <w:t xml:space="preserve">58%</w:t>
+            </w:r>
+          </w:p>
+        </w:tc>
+        <w:tc>
+          <w:tcPr>
+            <w:tcW w:w="1600" w:type="dxa"/>
             <w:vAlign w:val="top"/>
           </w:tcPr>
           <w:p>
@@ -4596,19 +6089,19 @@
         </w:tc>
         <w:tc>
           <w:tcPr>
-            <w:tcW w:w="5400" w:type="dxa"/>
-            <w:vAlign w:val="top"/>
-          </w:tcPr>
-          <w:p>
-            <w:pPr>
-              <w:spacing w:after="0"/>
-            </w:pPr>
-            <w:r>
-              <w:rPr>
-                <w:rFonts w:ascii="Arial" w:hAnsi="Arial" w:eastAsia="Microsoft YaHei"/>
-                <w:sz w:val="18"/>
-              </w:rPr>
-              <w:t xml:space="preserve">低价很显眼但与毛利目标冲突，因此时间一致性弱。</w:t>
+            <w:tcW w:w="5000" w:type="dxa"/>
+            <w:vAlign w:val="top"/>
+          </w:tcPr>
+          <w:p>
+            <w:pPr>
+              <w:spacing w:after="0"/>
+            </w:pPr>
+            <w:r>
+              <w:rPr>
+                <w:rFonts w:ascii="Arial" w:hAnsi="Arial" w:eastAsia="Microsoft YaHei"/>
+                <w:sz w:val="18"/>
+              </w:rPr>
+              <w:t xml:space="preserve">未提供真实历史行为数据；理性概率仍是模型先验，承诺和反应判断需要打折。</w:t>
             </w:r>
           </w:p>
         </w:tc>

</xml_diff>